<commit_message>
actualizacion con articulo cientifico
</commit_message>
<xml_diff>
--- a/proyecto/proyecto/documentacion/Guía para ejecutar página web.docx
+++ b/proyecto/proyecto/documentacion/Guía para ejecutar página web.docx
@@ -1942,7 +1942,25 @@
           <w:sz w:val="24"/>
           <w:szCs w:val="24"/>
         </w:rPr>
-        <w:t xml:space="preserve">Haz clic en </w:t>
+        <w:t xml:space="preserve">Haz </w:t>
+      </w:r>
+      <w:proofErr w:type="spellStart"/>
+      <w:r>
+        <w:rPr>
+          <w:rFonts w:ascii="Times New Roman" w:hAnsi="Times New Roman" w:cs="Times New Roman"/>
+          <w:sz w:val="24"/>
+          <w:szCs w:val="24"/>
+        </w:rPr>
+        <w:t>clic</w:t>
+      </w:r>
+      <w:proofErr w:type="spellEnd"/>
+      <w:r>
+        <w:rPr>
+          <w:rFonts w:ascii="Times New Roman" w:hAnsi="Times New Roman" w:cs="Times New Roman"/>
+          <w:sz w:val="24"/>
+          <w:szCs w:val="24"/>
+        </w:rPr>
+        <w:t xml:space="preserve"> en </w:t>
       </w:r>
       <w:proofErr w:type="spellStart"/>
       <w:r>
@@ -2441,7 +2459,16 @@
           <w:sz w:val="24"/>
           <w:szCs w:val="24"/>
         </w:rPr>
-        <w:t xml:space="preserve"> user@predictive.com</w:t>
+        <w:t xml:space="preserve"> </w:t>
+      </w:r>
+      <w:r>
+        <w:rPr>
+          <w:rFonts w:ascii="Times New Roman" w:hAnsi="Times New Roman" w:cs="Times New Roman"/>
+          <w:sz w:val="24"/>
+          <w:szCs w:val="24"/>
+          <w:lang w:val="es-419"/>
+        </w:rPr>
+        <w:t>user@predictive.com</w:t>
       </w:r>
     </w:p>
     <w:p>
@@ -2458,15 +2485,27 @@
           <w:szCs w:val="24"/>
         </w:rPr>
       </w:pPr>
-      <w:r>
-        <w:rPr>
-          <w:rFonts w:ascii="Times New Roman" w:hAnsi="Times New Roman" w:cs="Times New Roman"/>
-          <w:b/>
-          <w:bCs/>
-          <w:sz w:val="24"/>
-          <w:szCs w:val="24"/>
-        </w:rPr>
-        <w:t>Contraseña:</w:t>
+      <w:proofErr w:type="spellStart"/>
+      <w:r>
+        <w:rPr>
+          <w:rFonts w:ascii="Times New Roman" w:hAnsi="Times New Roman" w:cs="Times New Roman"/>
+          <w:b/>
+          <w:bCs/>
+          <w:sz w:val="24"/>
+          <w:szCs w:val="24"/>
+        </w:rPr>
+        <w:t>Contraseña</w:t>
+      </w:r>
+      <w:proofErr w:type="spellEnd"/>
+      <w:r>
+        <w:rPr>
+          <w:rFonts w:ascii="Times New Roman" w:hAnsi="Times New Roman" w:cs="Times New Roman"/>
+          <w:b/>
+          <w:bCs/>
+          <w:sz w:val="24"/>
+          <w:szCs w:val="24"/>
+        </w:rPr>
+        <w:t>:</w:t>
       </w:r>
       <w:r>
         <w:rPr>
@@ -2482,7 +2521,7 @@
           <w:sz w:val="24"/>
           <w:szCs w:val="24"/>
         </w:rPr>
-        <w:t>123456</w:t>
+        <w:t>user o user123</w:t>
       </w:r>
     </w:p>
     <w:p>
@@ -2867,23 +2906,13 @@
           <w:szCs w:val="24"/>
         </w:rPr>
       </w:pPr>
-      <w:proofErr w:type="spellStart"/>
-      <w:r>
-        <w:rPr>
-          <w:rFonts w:ascii="Times New Roman" w:hAnsi="Times New Roman" w:cs="Times New Roman"/>
-          <w:sz w:val="24"/>
-          <w:szCs w:val="24"/>
-        </w:rPr>
-        <w:t>Automáticamente</w:t>
-      </w:r>
-      <w:proofErr w:type="spellEnd"/>
-      <w:r>
-        <w:rPr>
-          <w:rFonts w:ascii="Times New Roman" w:hAnsi="Times New Roman" w:cs="Times New Roman"/>
-          <w:sz w:val="24"/>
-          <w:szCs w:val="24"/>
-        </w:rPr>
-        <w:t xml:space="preserve"> </w:t>
+      <w:r>
+        <w:rPr>
+          <w:rFonts w:ascii="Times New Roman" w:hAnsi="Times New Roman" w:cs="Times New Roman"/>
+          <w:sz w:val="24"/>
+          <w:szCs w:val="24"/>
+        </w:rPr>
+        <w:t xml:space="preserve">Automáticamente </w:t>
       </w:r>
       <w:proofErr w:type="spellStart"/>
       <w:r>
@@ -2960,13 +2989,23 @@
           <w:szCs w:val="24"/>
         </w:rPr>
       </w:pPr>
-      <w:r>
-        <w:rPr>
-          <w:rFonts w:ascii="Times New Roman" w:hAnsi="Times New Roman" w:cs="Times New Roman"/>
-          <w:sz w:val="24"/>
-          <w:szCs w:val="24"/>
-        </w:rPr>
-        <w:t xml:space="preserve">Equipos que </w:t>
+      <w:proofErr w:type="spellStart"/>
+      <w:r>
+        <w:rPr>
+          <w:rFonts w:ascii="Times New Roman" w:hAnsi="Times New Roman" w:cs="Times New Roman"/>
+          <w:sz w:val="24"/>
+          <w:szCs w:val="24"/>
+        </w:rPr>
+        <w:t>Equipos</w:t>
+      </w:r>
+      <w:proofErr w:type="spellEnd"/>
+      <w:r>
+        <w:rPr>
+          <w:rFonts w:ascii="Times New Roman" w:hAnsi="Times New Roman" w:cs="Times New Roman"/>
+          <w:sz w:val="24"/>
+          <w:szCs w:val="24"/>
+        </w:rPr>
+        <w:t xml:space="preserve"> que </w:t>
       </w:r>
       <w:proofErr w:type="spellStart"/>
       <w:r>
@@ -3035,8 +3074,18 @@
           <w:sz w:val="24"/>
           <w:szCs w:val="24"/>
         </w:rPr>
-        <w:t xml:space="preserve"> de equipos</w:t>
-      </w:r>
+        <w:t xml:space="preserve"> de </w:t>
+      </w:r>
+      <w:proofErr w:type="spellStart"/>
+      <w:r>
+        <w:rPr>
+          <w:rFonts w:ascii="Times New Roman" w:hAnsi="Times New Roman" w:cs="Times New Roman"/>
+          <w:sz w:val="24"/>
+          <w:szCs w:val="24"/>
+        </w:rPr>
+        <w:t>equipos</w:t>
+      </w:r>
+      <w:proofErr w:type="spellEnd"/>
     </w:p>
     <w:p>
       <w:pPr>
@@ -3115,25 +3164,7 @@
           <w:sz w:val="24"/>
           <w:szCs w:val="24"/>
         </w:rPr>
-        <w:t xml:space="preserve">Crear </w:t>
-      </w:r>
-      <w:proofErr w:type="spellStart"/>
-      <w:r>
-        <w:rPr>
-          <w:rFonts w:ascii="Times New Roman" w:hAnsi="Times New Roman" w:cs="Times New Roman"/>
-          <w:sz w:val="24"/>
-          <w:szCs w:val="24"/>
-        </w:rPr>
-        <w:t>nuevos</w:t>
-      </w:r>
-      <w:proofErr w:type="spellEnd"/>
-      <w:r>
-        <w:rPr>
-          <w:rFonts w:ascii="Times New Roman" w:hAnsi="Times New Roman" w:cs="Times New Roman"/>
-          <w:sz w:val="24"/>
-          <w:szCs w:val="24"/>
-        </w:rPr>
-        <w:t xml:space="preserve"> turnos</w:t>
+        <w:t>Crear nuevos turnos</w:t>
       </w:r>
     </w:p>
     <w:p>
@@ -3348,25 +3379,7 @@
           <w:sz w:val="24"/>
           <w:szCs w:val="24"/>
         </w:rPr>
-        <w:t xml:space="preserve">Admin puede </w:t>
-      </w:r>
-      <w:proofErr w:type="spellStart"/>
-      <w:r>
-        <w:rPr>
-          <w:rFonts w:ascii="Times New Roman" w:hAnsi="Times New Roman" w:cs="Times New Roman"/>
-          <w:sz w:val="24"/>
-          <w:szCs w:val="24"/>
-        </w:rPr>
-        <w:t>editar</w:t>
-      </w:r>
-      <w:proofErr w:type="spellEnd"/>
-      <w:r>
-        <w:rPr>
-          <w:rFonts w:ascii="Times New Roman" w:hAnsi="Times New Roman" w:cs="Times New Roman"/>
-          <w:sz w:val="24"/>
-          <w:szCs w:val="24"/>
-        </w:rPr>
-        <w:t>/eliminar incidentes</w:t>
+        <w:t>Admin puede editar/eliminar incidentes</w:t>
       </w:r>
     </w:p>
     <w:p>
@@ -3472,7 +3485,25 @@
           <w:sz w:val="24"/>
           <w:szCs w:val="24"/>
         </w:rPr>
-        <w:t xml:space="preserve"> todos los pagos</w:t>
+        <w:t xml:space="preserve"> </w:t>
+      </w:r>
+      <w:proofErr w:type="spellStart"/>
+      <w:r>
+        <w:rPr>
+          <w:rFonts w:ascii="Times New Roman" w:hAnsi="Times New Roman" w:cs="Times New Roman"/>
+          <w:sz w:val="24"/>
+          <w:szCs w:val="24"/>
+        </w:rPr>
+        <w:t>todos</w:t>
+      </w:r>
+      <w:proofErr w:type="spellEnd"/>
+      <w:r>
+        <w:rPr>
+          <w:rFonts w:ascii="Times New Roman" w:hAnsi="Times New Roman" w:cs="Times New Roman"/>
+          <w:sz w:val="24"/>
+          <w:szCs w:val="24"/>
+        </w:rPr>
+        <w:t xml:space="preserve"> los pagos</w:t>
       </w:r>
     </w:p>
     <w:p>
@@ -3537,8 +3568,18 @@
           <w:sz w:val="24"/>
           <w:szCs w:val="24"/>
         </w:rPr>
-        <w:t xml:space="preserve"> mensajes</w:t>
-      </w:r>
+        <w:t xml:space="preserve"> </w:t>
+      </w:r>
+      <w:proofErr w:type="spellStart"/>
+      <w:r>
+        <w:rPr>
+          <w:rFonts w:ascii="Times New Roman" w:hAnsi="Times New Roman" w:cs="Times New Roman"/>
+          <w:sz w:val="24"/>
+          <w:szCs w:val="24"/>
+        </w:rPr>
+        <w:t>mensajes</w:t>
+      </w:r>
+      <w:proofErr w:type="spellEnd"/>
     </w:p>
     <w:p>
       <w:pPr>
@@ -3596,8 +3637,18 @@
           <w:sz w:val="24"/>
           <w:szCs w:val="24"/>
         </w:rPr>
-        <w:t xml:space="preserve"> mensajes</w:t>
-      </w:r>
+        <w:t xml:space="preserve"> </w:t>
+      </w:r>
+      <w:proofErr w:type="spellStart"/>
+      <w:r>
+        <w:rPr>
+          <w:rFonts w:ascii="Times New Roman" w:hAnsi="Times New Roman" w:cs="Times New Roman"/>
+          <w:sz w:val="24"/>
+          <w:szCs w:val="24"/>
+        </w:rPr>
+        <w:t>mensajes</w:t>
+      </w:r>
+      <w:proofErr w:type="spellEnd"/>
     </w:p>
     <w:p>
       <w:pPr>
@@ -4184,7 +4235,7 @@
         <v:path o:extrusionok="f" gradientshapeok="t" o:connecttype="rect"/>
         <o:lock v:ext="edit" aspectratio="t"/>
       </v:shapetype>
-      <v:shape id="_x0000_i1025" type="#_x0000_t75" style="width:11.35pt;height:11.35pt" o:bullet="t">
+      <v:shape id="_x0000_i1025" type="#_x0000_t75" style="width:11.45pt;height:11.45pt" o:bullet="t">
         <v:imagedata r:id="rId1" o:title="mso7C93"/>
       </v:shape>
     </w:pict>
@@ -9253,7 +9304,6 @@
   <w:style w:type="character" w:default="1" w:styleId="Fuentedeprrafopredeter">
     <w:name w:val="Default Paragraph Font"/>
     <w:uiPriority w:val="1"/>
-    <w:semiHidden/>
     <w:unhideWhenUsed/>
   </w:style>
   <w:style w:type="table" w:default="1" w:styleId="Tablanormal">
@@ -9675,6 +9725,29 @@
       <w14:ligatures w14:val="none"/>
     </w:rPr>
   </w:style>
+  <w:style w:type="character" w:styleId="Hipervnculo">
+    <w:name w:val="Hyperlink"/>
+    <w:basedOn w:val="Fuentedeprrafopredeter"/>
+    <w:uiPriority w:val="99"/>
+    <w:unhideWhenUsed/>
+    <w:rsid w:val="00AE5994"/>
+    <w:rPr>
+      <w:color w:val="467886" w:themeColor="hyperlink"/>
+      <w:u w:val="single"/>
+    </w:rPr>
+  </w:style>
+  <w:style w:type="character" w:styleId="Mencinsinresolver">
+    <w:name w:val="Unresolved Mention"/>
+    <w:basedOn w:val="Fuentedeprrafopredeter"/>
+    <w:uiPriority w:val="99"/>
+    <w:semiHidden/>
+    <w:unhideWhenUsed/>
+    <w:rsid w:val="00AE5994"/>
+    <w:rPr>
+      <w:color w:val="605E5C"/>
+      <w:shd w:val="clear" w:color="auto" w:fill="E1DFDD"/>
+    </w:rPr>
+  </w:style>
 </w:styles>
 </file>
 

</xml_diff>